<commit_message>
Step 2 → Prisma 初始化 + User schema + .env 配置 + 执行迁移
</commit_message>
<xml_diff>
--- a/项目实时进展与log.docx
+++ b/项目实时进展与log.docx
@@ -239,13 +239,378 @@
     </w:p>
     <w:p>
       <w:pPr>
+        <w:pStyle w:val="2"/>
+        <w:bidi w:val="0"/>
         <w:rPr>
-          <w:rFonts w:hint="default"/>
+          <w:rFonts w:hint="eastAsia"/>
+          <w:lang w:val="en-US" w:eastAsia="zh-CN"/>
+        </w:rPr>
+      </w:pPr>
+      <w:r>
+        <w:rPr>
+          <w:rFonts w:hint="eastAsia"/>
+          <w:lang w:val="en-US" w:eastAsia="zh-CN"/>
+        </w:rPr>
+        <w:t>为什么用Prisma而不用传统数据库</w:t>
+      </w:r>
+    </w:p>
+    <w:p>
+      <w:r>
+        <w:rPr>
+          <w:rFonts w:hint="eastAsia"/>
+          <w:lang w:val="en-US" w:eastAsia="zh-CN"/>
+        </w:rPr>
+        <w:t>传统数据库：</w:t>
+      </w:r>
+      <w:r>
+        <w:rPr>
+          <w:rFonts w:hint="eastAsia"/>
+          <w:lang w:val="en-US" w:eastAsia="zh-CN"/>
+        </w:rPr>
+        <w:br w:type="textWrapping"/>
+      </w:r>
+      <w:r>
+        <w:drawing>
+          <wp:inline distT="0" distB="0" distL="114300" distR="114300">
+            <wp:extent cx="5269865" cy="3007360"/>
+            <wp:effectExtent l="0" t="0" r="3175" b="10160"/>
+            <wp:docPr id="6" name="图片 1"/>
+            <wp:cNvGraphicFramePr>
+              <a:graphicFrameLocks xmlns:a="http://schemas.openxmlformats.org/drawingml/2006/main" noChangeAspect="1"/>
+            </wp:cNvGraphicFramePr>
+            <a:graphic xmlns:a="http://schemas.openxmlformats.org/drawingml/2006/main">
+              <a:graphicData uri="http://schemas.openxmlformats.org/drawingml/2006/picture">
+                <pic:pic xmlns:pic="http://schemas.openxmlformats.org/drawingml/2006/picture">
+                  <pic:nvPicPr>
+                    <pic:cNvPr id="6" name="图片 1"/>
+                    <pic:cNvPicPr>
+                      <a:picLocks noChangeAspect="1"/>
+                    </pic:cNvPicPr>
+                  </pic:nvPicPr>
+                  <pic:blipFill>
+                    <a:blip r:embed="rId9"/>
+                    <a:stretch>
+                      <a:fillRect/>
+                    </a:stretch>
+                  </pic:blipFill>
+                  <pic:spPr>
+                    <a:xfrm>
+                      <a:off x="0" y="0"/>
+                      <a:ext cx="5269865" cy="3007360"/>
+                    </a:xfrm>
+                    <a:prstGeom prst="rect">
+                      <a:avLst/>
+                    </a:prstGeom>
+                    <a:noFill/>
+                    <a:ln>
+                      <a:noFill/>
+                    </a:ln>
+                  </pic:spPr>
+                </pic:pic>
+              </a:graphicData>
+            </a:graphic>
+          </wp:inline>
+        </w:drawing>
+      </w:r>
+    </w:p>
+    <w:p>
+      <w:r>
+        <w:rPr>
+          <w:rFonts w:hint="eastAsia"/>
+          <w:lang w:val="en-US" w:eastAsia="zh-CN"/>
+        </w:rPr>
+        <w:t>Prisma:</w:t>
+      </w:r>
+      <w:r>
+        <w:rPr>
+          <w:rFonts w:hint="eastAsia"/>
+          <w:lang w:val="en-US" w:eastAsia="zh-CN"/>
+        </w:rPr>
+        <w:br w:type="textWrapping"/>
+      </w:r>
+      <w:r>
+        <w:drawing>
+          <wp:inline distT="0" distB="0" distL="114300" distR="114300">
+            <wp:extent cx="5270500" cy="3078480"/>
+            <wp:effectExtent l="0" t="0" r="2540" b="0"/>
+            <wp:docPr id="7" name="图片 2"/>
+            <wp:cNvGraphicFramePr>
+              <a:graphicFrameLocks xmlns:a="http://schemas.openxmlformats.org/drawingml/2006/main" noChangeAspect="1"/>
+            </wp:cNvGraphicFramePr>
+            <a:graphic xmlns:a="http://schemas.openxmlformats.org/drawingml/2006/main">
+              <a:graphicData uri="http://schemas.openxmlformats.org/drawingml/2006/picture">
+                <pic:pic xmlns:pic="http://schemas.openxmlformats.org/drawingml/2006/picture">
+                  <pic:nvPicPr>
+                    <pic:cNvPr id="7" name="图片 2"/>
+                    <pic:cNvPicPr>
+                      <a:picLocks noChangeAspect="1"/>
+                    </pic:cNvPicPr>
+                  </pic:nvPicPr>
+                  <pic:blipFill>
+                    <a:blip r:embed="rId10"/>
+                    <a:stretch>
+                      <a:fillRect/>
+                    </a:stretch>
+                  </pic:blipFill>
+                  <pic:spPr>
+                    <a:xfrm>
+                      <a:off x="0" y="0"/>
+                      <a:ext cx="5270500" cy="3078480"/>
+                    </a:xfrm>
+                    <a:prstGeom prst="rect">
+                      <a:avLst/>
+                    </a:prstGeom>
+                    <a:noFill/>
+                    <a:ln>
+                      <a:noFill/>
+                    </a:ln>
+                  </pic:spPr>
+                </pic:pic>
+              </a:graphicData>
+            </a:graphic>
+          </wp:inline>
+        </w:drawing>
+      </w:r>
+    </w:p>
+    <w:p>
+      <w:r>
+        <w:drawing>
+          <wp:inline distT="0" distB="0" distL="114300" distR="114300">
+            <wp:extent cx="5272405" cy="4444365"/>
+            <wp:effectExtent l="0" t="0" r="635" b="5715"/>
+            <wp:docPr id="8" name="图片 3"/>
+            <wp:cNvGraphicFramePr>
+              <a:graphicFrameLocks xmlns:a="http://schemas.openxmlformats.org/drawingml/2006/main" noChangeAspect="1"/>
+            </wp:cNvGraphicFramePr>
+            <a:graphic xmlns:a="http://schemas.openxmlformats.org/drawingml/2006/main">
+              <a:graphicData uri="http://schemas.openxmlformats.org/drawingml/2006/picture">
+                <pic:pic xmlns:pic="http://schemas.openxmlformats.org/drawingml/2006/picture">
+                  <pic:nvPicPr>
+                    <pic:cNvPr id="8" name="图片 3"/>
+                    <pic:cNvPicPr>
+                      <a:picLocks noChangeAspect="1"/>
+                    </pic:cNvPicPr>
+                  </pic:nvPicPr>
+                  <pic:blipFill>
+                    <a:blip r:embed="rId11"/>
+                    <a:stretch>
+                      <a:fillRect/>
+                    </a:stretch>
+                  </pic:blipFill>
+                  <pic:spPr>
+                    <a:xfrm>
+                      <a:off x="0" y="0"/>
+                      <a:ext cx="5272405" cy="4444365"/>
+                    </a:xfrm>
+                    <a:prstGeom prst="rect">
+                      <a:avLst/>
+                    </a:prstGeom>
+                    <a:noFill/>
+                    <a:ln>
+                      <a:noFill/>
+                    </a:ln>
+                  </pic:spPr>
+                </pic:pic>
+              </a:graphicData>
+            </a:graphic>
+          </wp:inline>
+        </w:drawing>
+      </w:r>
+    </w:p>
+    <w:p>
+      <w:r>
+        <w:drawing>
+          <wp:inline distT="0" distB="0" distL="114300" distR="114300">
+            <wp:extent cx="5274310" cy="4082415"/>
+            <wp:effectExtent l="0" t="0" r="13970" b="1905"/>
+            <wp:docPr id="9" name="图片 4"/>
+            <wp:cNvGraphicFramePr>
+              <a:graphicFrameLocks xmlns:a="http://schemas.openxmlformats.org/drawingml/2006/main" noChangeAspect="1"/>
+            </wp:cNvGraphicFramePr>
+            <a:graphic xmlns:a="http://schemas.openxmlformats.org/drawingml/2006/main">
+              <a:graphicData uri="http://schemas.openxmlformats.org/drawingml/2006/picture">
+                <pic:pic xmlns:pic="http://schemas.openxmlformats.org/drawingml/2006/picture">
+                  <pic:nvPicPr>
+                    <pic:cNvPr id="9" name="图片 4"/>
+                    <pic:cNvPicPr>
+                      <a:picLocks noChangeAspect="1"/>
+                    </pic:cNvPicPr>
+                  </pic:nvPicPr>
+                  <pic:blipFill>
+                    <a:blip r:embed="rId12"/>
+                    <a:stretch>
+                      <a:fillRect/>
+                    </a:stretch>
+                  </pic:blipFill>
+                  <pic:spPr>
+                    <a:xfrm>
+                      <a:off x="0" y="0"/>
+                      <a:ext cx="5274310" cy="4082415"/>
+                    </a:xfrm>
+                    <a:prstGeom prst="rect">
+                      <a:avLst/>
+                    </a:prstGeom>
+                    <a:noFill/>
+                    <a:ln>
+                      <a:noFill/>
+                    </a:ln>
+                  </pic:spPr>
+                </pic:pic>
+              </a:graphicData>
+            </a:graphic>
+          </wp:inline>
+        </w:drawing>
+      </w:r>
+    </w:p>
+    <w:p>
+      <w:r>
+        <w:drawing>
+          <wp:inline distT="0" distB="0" distL="114300" distR="114300">
+            <wp:extent cx="5271770" cy="4034790"/>
+            <wp:effectExtent l="0" t="0" r="1270" b="3810"/>
+            <wp:docPr id="10" name="图片 5"/>
+            <wp:cNvGraphicFramePr>
+              <a:graphicFrameLocks xmlns:a="http://schemas.openxmlformats.org/drawingml/2006/main" noChangeAspect="1"/>
+            </wp:cNvGraphicFramePr>
+            <a:graphic xmlns:a="http://schemas.openxmlformats.org/drawingml/2006/main">
+              <a:graphicData uri="http://schemas.openxmlformats.org/drawingml/2006/picture">
+                <pic:pic xmlns:pic="http://schemas.openxmlformats.org/drawingml/2006/picture">
+                  <pic:nvPicPr>
+                    <pic:cNvPr id="10" name="图片 5"/>
+                    <pic:cNvPicPr>
+                      <a:picLocks noChangeAspect="1"/>
+                    </pic:cNvPicPr>
+                  </pic:nvPicPr>
+                  <pic:blipFill>
+                    <a:blip r:embed="rId13"/>
+                    <a:stretch>
+                      <a:fillRect/>
+                    </a:stretch>
+                  </pic:blipFill>
+                  <pic:spPr>
+                    <a:xfrm>
+                      <a:off x="0" y="0"/>
+                      <a:ext cx="5271770" cy="4034790"/>
+                    </a:xfrm>
+                    <a:prstGeom prst="rect">
+                      <a:avLst/>
+                    </a:prstGeom>
+                    <a:noFill/>
+                    <a:ln>
+                      <a:noFill/>
+                    </a:ln>
+                  </pic:spPr>
+                </pic:pic>
+              </a:graphicData>
+            </a:graphic>
+          </wp:inline>
+        </w:drawing>
+      </w:r>
+    </w:p>
+    <w:p>
+      <w:r>
+        <w:drawing>
+          <wp:inline distT="0" distB="0" distL="114300" distR="114300">
+            <wp:extent cx="5274310" cy="5125720"/>
+            <wp:effectExtent l="0" t="0" r="13970" b="10160"/>
+            <wp:docPr id="11" name="图片 6"/>
+            <wp:cNvGraphicFramePr>
+              <a:graphicFrameLocks xmlns:a="http://schemas.openxmlformats.org/drawingml/2006/main" noChangeAspect="1"/>
+            </wp:cNvGraphicFramePr>
+            <a:graphic xmlns:a="http://schemas.openxmlformats.org/drawingml/2006/main">
+              <a:graphicData uri="http://schemas.openxmlformats.org/drawingml/2006/picture">
+                <pic:pic xmlns:pic="http://schemas.openxmlformats.org/drawingml/2006/picture">
+                  <pic:nvPicPr>
+                    <pic:cNvPr id="11" name="图片 6"/>
+                    <pic:cNvPicPr>
+                      <a:picLocks noChangeAspect="1"/>
+                    </pic:cNvPicPr>
+                  </pic:nvPicPr>
+                  <pic:blipFill>
+                    <a:blip r:embed="rId14"/>
+                    <a:stretch>
+                      <a:fillRect/>
+                    </a:stretch>
+                  </pic:blipFill>
+                  <pic:spPr>
+                    <a:xfrm>
+                      <a:off x="0" y="0"/>
+                      <a:ext cx="5274310" cy="5125720"/>
+                    </a:xfrm>
+                    <a:prstGeom prst="rect">
+                      <a:avLst/>
+                    </a:prstGeom>
+                    <a:noFill/>
+                    <a:ln>
+                      <a:noFill/>
+                    </a:ln>
+                  </pic:spPr>
+                </pic:pic>
+              </a:graphicData>
+            </a:graphic>
+          </wp:inline>
+        </w:drawing>
+      </w:r>
+    </w:p>
+    <w:p>
+      <w:pPr>
+        <w:rPr>
+          <w:rFonts w:hint="eastAsia" w:eastAsiaTheme="minorEastAsia"/>
           <w:lang w:val="en-US" w:eastAsia="zh-CN"/>
         </w:rPr>
       </w:pPr>
       <w:bookmarkStart w:id="0" w:name="_GoBack"/>
+      <w:r>
+        <w:drawing>
+          <wp:inline distT="0" distB="0" distL="114300" distR="114300">
+            <wp:extent cx="5269865" cy="4820920"/>
+            <wp:effectExtent l="0" t="0" r="3175" b="10160"/>
+            <wp:docPr id="12" name="图片 7"/>
+            <wp:cNvGraphicFramePr>
+              <a:graphicFrameLocks xmlns:a="http://schemas.openxmlformats.org/drawingml/2006/main" noChangeAspect="1"/>
+            </wp:cNvGraphicFramePr>
+            <a:graphic xmlns:a="http://schemas.openxmlformats.org/drawingml/2006/main">
+              <a:graphicData uri="http://schemas.openxmlformats.org/drawingml/2006/picture">
+                <pic:pic xmlns:pic="http://schemas.openxmlformats.org/drawingml/2006/picture">
+                  <pic:nvPicPr>
+                    <pic:cNvPr id="12" name="图片 7"/>
+                    <pic:cNvPicPr>
+                      <a:picLocks noChangeAspect="1"/>
+                    </pic:cNvPicPr>
+                  </pic:nvPicPr>
+                  <pic:blipFill>
+                    <a:blip r:embed="rId15"/>
+                    <a:stretch>
+                      <a:fillRect/>
+                    </a:stretch>
+                  </pic:blipFill>
+                  <pic:spPr>
+                    <a:xfrm>
+                      <a:off x="0" y="0"/>
+                      <a:ext cx="5269865" cy="4820920"/>
+                    </a:xfrm>
+                    <a:prstGeom prst="rect">
+                      <a:avLst/>
+                    </a:prstGeom>
+                    <a:noFill/>
+                    <a:ln>
+                      <a:noFill/>
+                    </a:ln>
+                  </pic:spPr>
+                </pic:pic>
+              </a:graphicData>
+            </a:graphic>
+          </wp:inline>
+        </w:drawing>
+      </w:r>
       <w:bookmarkEnd w:id="0"/>
+      <w:r>
+        <w:rPr>
+          <w:rFonts w:hint="eastAsia"/>
+          <w:lang w:val="en-US" w:eastAsia="zh-CN"/>
+        </w:rPr>
+        <w:t>+</w:t>
+      </w:r>
     </w:p>
     <w:sectPr>
       <w:pgSz w:w="11906" w:h="16838"/>
@@ -270,7 +635,7 @@
   <w:latentStyles w:count="260" w:defQFormat="0" w:defUnhideWhenUsed="1" w:defSemiHidden="1" w:defUIPriority="99" w:defLockedState="0">
     <w:lsdException w:qFormat="1" w:unhideWhenUsed="0" w:uiPriority="0" w:semiHidden="0" w:name="Normal"/>
     <w:lsdException w:qFormat="1" w:unhideWhenUsed="0" w:uiPriority="0" w:semiHidden="0" w:name="heading 1"/>
-    <w:lsdException w:qFormat="1" w:uiPriority="0" w:name="heading 2"/>
+    <w:lsdException w:qFormat="1" w:uiPriority="0" w:semiHidden="0" w:name="heading 2"/>
     <w:lsdException w:qFormat="1" w:uiPriority="0" w:name="heading 3"/>
     <w:lsdException w:qFormat="1" w:uiPriority="0" w:name="heading 4"/>
     <w:lsdException w:qFormat="1" w:uiPriority="0" w:name="heading 5"/>
@@ -371,7 +736,7 @@
     <w:lsdException w:unhideWhenUsed="0" w:uiPriority="0" w:semiHidden="0" w:name="HTML Sample"/>
     <w:lsdException w:unhideWhenUsed="0" w:uiPriority="0" w:semiHidden="0" w:name="HTML Typewriter"/>
     <w:lsdException w:unhideWhenUsed="0" w:uiPriority="0" w:semiHidden="0" w:name="HTML Variable"/>
-    <w:lsdException w:unhideWhenUsed="0" w:uiPriority="0" w:name="Normal Table"/>
+    <w:lsdException w:qFormat="1" w:unhideWhenUsed="0" w:uiPriority="0" w:name="Normal Table"/>
     <w:lsdException w:unhideWhenUsed="0" w:uiPriority="0" w:semiHidden="0" w:name="annotation subject"/>
     <w:lsdException w:unhideWhenUsed="0" w:uiPriority="0" w:semiHidden="0" w:name="Table Simple 1"/>
     <w:lsdException w:unhideWhenUsed="0" w:uiPriority="0" w:semiHidden="0" w:name="Table Simple 2"/>
@@ -533,14 +898,34 @@
       <w:lang w:val="en-US" w:eastAsia="zh-CN" w:bidi="ar-SA"/>
     </w:rPr>
   </w:style>
-  <w:style w:type="character" w:default="1" w:styleId="3">
+  <w:style w:type="paragraph" w:styleId="2">
+    <w:name w:val="heading 2"/>
+    <w:basedOn w:val="1"/>
+    <w:next w:val="1"/>
+    <w:unhideWhenUsed/>
+    <w:qFormat/>
+    <w:uiPriority w:val="0"/>
+    <w:pPr>
+      <w:keepNext/>
+      <w:keepLines/>
+      <w:spacing w:before="260" w:beforeLines="0" w:beforeAutospacing="0" w:after="260" w:afterLines="0" w:afterAutospacing="0" w:line="413" w:lineRule="auto"/>
+      <w:outlineLvl w:val="1"/>
+    </w:pPr>
+    <w:rPr>
+      <w:rFonts w:ascii="Arial" w:hAnsi="Arial" w:eastAsia="黑体"/>
+      <w:b/>
+      <w:sz w:val="32"/>
+    </w:rPr>
+  </w:style>
+  <w:style w:type="character" w:default="1" w:styleId="4">
     <w:name w:val="Default Paragraph Font"/>
     <w:semiHidden/>
     <w:uiPriority w:val="0"/>
   </w:style>
-  <w:style w:type="table" w:default="1" w:styleId="2">
+  <w:style w:type="table" w:default="1" w:styleId="3">
     <w:name w:val="Normal Table"/>
     <w:semiHidden/>
+    <w:qFormat/>
     <w:uiPriority w:val="0"/>
     <w:tblPr>
       <w:tblCellMar>

</xml_diff>

<commit_message>
Step 6 → ProtectedController（受保护接口）
</commit_message>
<xml_diff>
--- a/项目实时进展与log.docx
+++ b/项目实时进展与log.docx
@@ -239,7 +239,7 @@
     </w:p>
     <w:p>
       <w:pPr>
-        <w:pStyle w:val="2"/>
+        <w:pStyle w:val="3"/>
         <w:bidi w:val="0"/>
         <w:rPr>
           <w:rFonts w:hint="eastAsia"/>
@@ -553,12 +553,6 @@
       </w:r>
     </w:p>
     <w:p>
-      <w:pPr>
-        <w:rPr>
-          <w:rFonts w:hint="eastAsia" w:eastAsiaTheme="minorEastAsia"/>
-          <w:lang w:val="en-US" w:eastAsia="zh-CN"/>
-        </w:rPr>
-      </w:pPr>
       <w:r>
         <w:drawing>
           <wp:inline distT="0" distB="0" distL="114300" distR="114300">
@@ -602,8 +596,6 @@
           </wp:inline>
         </w:drawing>
       </w:r>
-      <w:bookmarkStart w:id="0" w:name="_GoBack"/>
-      <w:bookmarkEnd w:id="0"/>
       <w:r>
         <w:drawing>
           <wp:inline distT="0" distB="0" distL="114300" distR="114300">
@@ -648,6 +640,796 @@
         </w:drawing>
       </w:r>
     </w:p>
+    <w:p>
+      <w:pPr>
+        <w:pStyle w:val="2"/>
+        <w:bidi w:val="0"/>
+        <w:rPr>
+          <w:rFonts w:hint="eastAsia"/>
+          <w:lang w:val="en-US" w:eastAsia="zh-CN"/>
+        </w:rPr>
+      </w:pPr>
+      <w:r>
+        <w:rPr>
+          <w:rFonts w:hint="eastAsia"/>
+          <w:lang w:val="en-US" w:eastAsia="zh-CN"/>
+        </w:rPr>
+        <w:t>项目后端测试：</w:t>
+      </w:r>
+    </w:p>
+    <w:p>
+      <w:pPr>
+        <w:rPr>
+          <w:rFonts w:hint="eastAsia"/>
+          <w:lang w:val="en-US" w:eastAsia="zh-CN"/>
+        </w:rPr>
+      </w:pPr>
+      <w:r>
+        <w:rPr>
+          <w:rFonts w:hint="eastAsia"/>
+          <w:lang w:val="en-US" w:eastAsia="zh-CN"/>
+        </w:rPr>
+        <w:t>1.进入后端目录并且运行后端：</w:t>
+      </w:r>
+      <w:r>
+        <w:rPr>
+          <w:rFonts w:hint="eastAsia"/>
+          <w:lang w:val="en-US" w:eastAsia="zh-CN"/>
+        </w:rPr>
+        <w:br w:type="textWrapping"/>
+      </w:r>
+      <w:r>
+        <w:rPr>
+          <w:rFonts w:hint="eastAsia"/>
+          <w:lang w:val="en-US" w:eastAsia="zh-CN"/>
+        </w:rPr>
+        <w:t>cd x:\my-project150326\backend</w:t>
+      </w:r>
+    </w:p>
+    <w:p>
+      <w:pPr>
+        <w:rPr>
+          <w:rFonts w:hint="eastAsia"/>
+          <w:lang w:val="en-US" w:eastAsia="zh-CN"/>
+        </w:rPr>
+      </w:pPr>
+      <w:r>
+        <w:rPr>
+          <w:rFonts w:hint="eastAsia"/>
+          <w:lang w:val="en-US" w:eastAsia="zh-CN"/>
+        </w:rPr>
+        <w:t>npm run start:dev</w:t>
+      </w:r>
+    </w:p>
+    <w:p>
+      <w:pPr>
+        <w:numPr>
+          <w:ilvl w:val="0"/>
+          <w:numId w:val="1"/>
+        </w:numPr>
+        <w:rPr>
+          <w:rFonts w:hint="default"/>
+          <w:lang w:val="en-US" w:eastAsia="zh-CN"/>
+        </w:rPr>
+      </w:pPr>
+      <w:r>
+        <w:rPr>
+          <w:rFonts w:hint="eastAsia"/>
+          <w:lang w:val="en-US" w:eastAsia="zh-CN"/>
+        </w:rPr>
+        <w:t>打开powershell并进入后端 目录</w:t>
+      </w:r>
+    </w:p>
+    <w:p>
+      <w:pPr>
+        <w:numPr>
+          <w:ilvl w:val="0"/>
+          <w:numId w:val="1"/>
+        </w:numPr>
+        <w:rPr>
+          <w:rFonts w:hint="default"/>
+          <w:lang w:val="en-US" w:eastAsia="zh-CN"/>
+        </w:rPr>
+      </w:pPr>
+      <w:r>
+        <w:rPr>
+          <w:rFonts w:hint="eastAsia"/>
+          <w:lang w:val="en-US" w:eastAsia="zh-CN"/>
+        </w:rPr>
+        <w:t>测试注册:</w:t>
+      </w:r>
+    </w:p>
+    <w:p>
+      <w:pPr>
+        <w:numPr>
+          <w:numId w:val="0"/>
+        </w:numPr>
+        <w:rPr>
+          <w:rFonts w:hint="eastAsia"/>
+          <w:lang w:val="en-US" w:eastAsia="zh-CN"/>
+        </w:rPr>
+      </w:pPr>
+      <w:r>
+        <w:rPr>
+          <w:rFonts w:hint="eastAsia"/>
+          <w:lang w:val="en-US" w:eastAsia="zh-CN"/>
+        </w:rPr>
+        <w:t>Invoke-RestMethod -Uri "http://localhost:3001/auth/register" `</w:t>
+      </w:r>
+    </w:p>
+    <w:p>
+      <w:pPr>
+        <w:numPr>
+          <w:numId w:val="0"/>
+        </w:numPr>
+        <w:rPr>
+          <w:rFonts w:hint="eastAsia"/>
+          <w:lang w:val="en-US" w:eastAsia="zh-CN"/>
+        </w:rPr>
+      </w:pPr>
+      <w:r>
+        <w:rPr>
+          <w:rFonts w:hint="eastAsia"/>
+          <w:lang w:val="en-US" w:eastAsia="zh-CN"/>
+        </w:rPr>
+        <w:t xml:space="preserve">  -Method POST `</w:t>
+      </w:r>
+    </w:p>
+    <w:p>
+      <w:pPr>
+        <w:numPr>
+          <w:numId w:val="0"/>
+        </w:numPr>
+        <w:rPr>
+          <w:rFonts w:hint="eastAsia"/>
+          <w:lang w:val="en-US" w:eastAsia="zh-CN"/>
+        </w:rPr>
+      </w:pPr>
+      <w:r>
+        <w:rPr>
+          <w:rFonts w:hint="eastAsia"/>
+          <w:lang w:val="en-US" w:eastAsia="zh-CN"/>
+        </w:rPr>
+        <w:t xml:space="preserve">  -ContentType "application/json" `</w:t>
+      </w:r>
+    </w:p>
+    <w:p>
+      <w:pPr>
+        <w:numPr>
+          <w:numId w:val="0"/>
+        </w:numPr>
+        <w:rPr>
+          <w:rFonts w:hint="eastAsia"/>
+          <w:lang w:val="en-US" w:eastAsia="zh-CN"/>
+        </w:rPr>
+      </w:pPr>
+      <w:r>
+        <w:rPr>
+          <w:rFonts w:hint="eastAsia"/>
+          <w:lang w:val="en-US" w:eastAsia="zh-CN"/>
+        </w:rPr>
+        <w:t xml:space="preserve">  -Body '{"email":"你的邮箱@test.com","username":"你的名字","password":"123456"}'</w:t>
+      </w:r>
+    </w:p>
+    <w:p>
+      <w:pPr>
+        <w:numPr>
+          <w:ilvl w:val="0"/>
+          <w:numId w:val="1"/>
+        </w:numPr>
+        <w:ind w:left="0" w:leftChars="0" w:firstLine="0" w:firstLineChars="0"/>
+        <w:rPr>
+          <w:rFonts w:hint="eastAsia"/>
+          <w:lang w:val="en-US" w:eastAsia="zh-CN"/>
+        </w:rPr>
+      </w:pPr>
+      <w:r>
+        <w:rPr>
+          <w:rFonts w:hint="eastAsia"/>
+          <w:lang w:val="en-US" w:eastAsia="zh-CN"/>
+        </w:rPr>
+        <w:t>验证重复注册：</w:t>
+      </w:r>
+      <w:r>
+        <w:rPr>
+          <w:rFonts w:hint="eastAsia"/>
+          <w:lang w:val="en-US" w:eastAsia="zh-CN"/>
+        </w:rPr>
+        <w:br w:type="textWrapping"/>
+      </w:r>
+      <w:r>
+        <w:rPr>
+          <w:rFonts w:hint="eastAsia"/>
+          <w:lang w:val="en-US" w:eastAsia="zh-CN"/>
+        </w:rPr>
+        <w:t>Invoke-RestMethod -Uri "http://localhost:3001/auth/register" `</w:t>
+      </w:r>
+    </w:p>
+    <w:p>
+      <w:pPr>
+        <w:numPr>
+          <w:numId w:val="0"/>
+        </w:numPr>
+        <w:ind w:leftChars="0"/>
+        <w:rPr>
+          <w:rFonts w:hint="eastAsia"/>
+          <w:lang w:val="en-US" w:eastAsia="zh-CN"/>
+        </w:rPr>
+      </w:pPr>
+      <w:r>
+        <w:rPr>
+          <w:rFonts w:hint="eastAsia"/>
+          <w:lang w:val="en-US" w:eastAsia="zh-CN"/>
+        </w:rPr>
+        <w:t xml:space="preserve">  -Method POST `</w:t>
+      </w:r>
+    </w:p>
+    <w:p>
+      <w:pPr>
+        <w:numPr>
+          <w:numId w:val="0"/>
+        </w:numPr>
+        <w:ind w:leftChars="0"/>
+        <w:rPr>
+          <w:rFonts w:hint="eastAsia"/>
+          <w:lang w:val="en-US" w:eastAsia="zh-CN"/>
+        </w:rPr>
+      </w:pPr>
+      <w:r>
+        <w:rPr>
+          <w:rFonts w:hint="eastAsia"/>
+          <w:lang w:val="en-US" w:eastAsia="zh-CN"/>
+        </w:rPr>
+        <w:t xml:space="preserve">  -ContentType "application/json" `</w:t>
+      </w:r>
+    </w:p>
+    <w:p>
+      <w:pPr>
+        <w:numPr>
+          <w:numId w:val="0"/>
+        </w:numPr>
+        <w:ind w:leftChars="0"/>
+        <w:rPr>
+          <w:rFonts w:hint="eastAsia"/>
+          <w:lang w:val="en-US" w:eastAsia="zh-CN"/>
+        </w:rPr>
+      </w:pPr>
+      <w:r>
+        <w:rPr>
+          <w:rFonts w:hint="eastAsia"/>
+          <w:lang w:val="en-US" w:eastAsia="zh-CN"/>
+        </w:rPr>
+        <w:t xml:space="preserve">  -Body '{"email":"你的邮箱@test.com","username":"你的名字","password":"123456"}'</w:t>
+      </w:r>
+    </w:p>
+    <w:p>
+      <w:pPr>
+        <w:numPr>
+          <w:numId w:val="0"/>
+        </w:numPr>
+        <w:ind w:leftChars="0"/>
+        <w:rPr>
+          <w:rFonts w:hint="eastAsia"/>
+          <w:lang w:val="en-US" w:eastAsia="zh-CN"/>
+        </w:rPr>
+      </w:pPr>
+      <w:r>
+        <w:rPr>
+          <w:rFonts w:hint="eastAsia"/>
+          <w:lang w:val="en-US" w:eastAsia="zh-CN"/>
+        </w:rPr>
+        <w:t>期望结果：409 提示邮箱重复已被注册</w:t>
+      </w:r>
+    </w:p>
+    <w:p>
+      <w:pPr>
+        <w:numPr>
+          <w:ilvl w:val="0"/>
+          <w:numId w:val="1"/>
+        </w:numPr>
+        <w:ind w:left="0" w:leftChars="0" w:firstLine="0" w:firstLineChars="0"/>
+        <w:rPr>
+          <w:rFonts w:hint="eastAsia"/>
+          <w:lang w:val="en-US" w:eastAsia="zh-CN"/>
+        </w:rPr>
+      </w:pPr>
+      <w:r>
+        <w:rPr>
+          <w:rFonts w:hint="eastAsia"/>
+          <w:lang w:val="en-US" w:eastAsia="zh-CN"/>
+        </w:rPr>
+        <w:t>测试login：</w:t>
+      </w:r>
+      <w:r>
+        <w:rPr>
+          <w:rFonts w:hint="eastAsia"/>
+          <w:lang w:val="en-US" w:eastAsia="zh-CN"/>
+        </w:rPr>
+        <w:br w:type="textWrapping"/>
+      </w:r>
+      <w:r>
+        <w:rPr>
+          <w:rFonts w:hint="eastAsia"/>
+          <w:lang w:val="en-US" w:eastAsia="zh-CN"/>
+        </w:rPr>
+        <w:t>Invoke-RestMethod -Uri "http://localhost:3001/auth/login" `</w:t>
+      </w:r>
+    </w:p>
+    <w:p>
+      <w:pPr>
+        <w:numPr>
+          <w:numId w:val="0"/>
+        </w:numPr>
+        <w:ind w:leftChars="0"/>
+        <w:rPr>
+          <w:rFonts w:hint="eastAsia"/>
+          <w:lang w:val="en-US" w:eastAsia="zh-CN"/>
+        </w:rPr>
+      </w:pPr>
+      <w:r>
+        <w:rPr>
+          <w:rFonts w:hint="eastAsia"/>
+          <w:lang w:val="en-US" w:eastAsia="zh-CN"/>
+        </w:rPr>
+        <w:t xml:space="preserve">  -Method POST `</w:t>
+      </w:r>
+    </w:p>
+    <w:p>
+      <w:pPr>
+        <w:numPr>
+          <w:numId w:val="0"/>
+        </w:numPr>
+        <w:ind w:leftChars="0"/>
+        <w:rPr>
+          <w:rFonts w:hint="eastAsia"/>
+          <w:lang w:val="en-US" w:eastAsia="zh-CN"/>
+        </w:rPr>
+      </w:pPr>
+      <w:r>
+        <w:rPr>
+          <w:rFonts w:hint="eastAsia"/>
+          <w:lang w:val="en-US" w:eastAsia="zh-CN"/>
+        </w:rPr>
+        <w:t xml:space="preserve">  -ContentType "application/json" `</w:t>
+      </w:r>
+    </w:p>
+    <w:p>
+      <w:pPr>
+        <w:numPr>
+          <w:numId w:val="0"/>
+        </w:numPr>
+        <w:ind w:leftChars="0"/>
+        <w:rPr>
+          <w:rFonts w:hint="eastAsia"/>
+          <w:lang w:val="en-US" w:eastAsia="zh-CN"/>
+        </w:rPr>
+      </w:pPr>
+      <w:r>
+        <w:rPr>
+          <w:rFonts w:hint="eastAsia"/>
+          <w:lang w:val="en-US" w:eastAsia="zh-CN"/>
+        </w:rPr>
+        <w:t xml:space="preserve">  -Body '{"email":"你的邮箱@test.com","password":"123456"}'</w:t>
+      </w:r>
+    </w:p>
+    <w:p>
+      <w:pPr>
+        <w:numPr>
+          <w:numId w:val="0"/>
+        </w:numPr>
+        <w:ind w:leftChars="0"/>
+        <w:rPr>
+          <w:rFonts w:hint="eastAsia"/>
+          <w:lang w:val="en-US" w:eastAsia="zh-CN"/>
+        </w:rPr>
+      </w:pPr>
+      <w:r>
+        <w:rPr>
+          <w:rFonts w:hint="eastAsia"/>
+          <w:lang w:val="en-US" w:eastAsia="zh-CN"/>
+        </w:rPr>
+        <w:t>期望结果：返回new access token</w:t>
+      </w:r>
+    </w:p>
+    <w:p>
+      <w:pPr>
+        <w:numPr>
+          <w:numId w:val="0"/>
+        </w:numPr>
+        <w:ind w:leftChars="0"/>
+        <w:rPr>
+          <w:rFonts w:hint="eastAsia"/>
+          <w:lang w:val="en-US" w:eastAsia="zh-CN"/>
+        </w:rPr>
+      </w:pPr>
+      <w:r>
+        <w:rPr>
+          <w:rFonts w:hint="eastAsia"/>
+          <w:lang w:val="en-US" w:eastAsia="zh-CN"/>
+        </w:rPr>
+        <w:t>如果token太长不显示完全：</w:t>
+      </w:r>
+      <w:r>
+        <w:rPr>
+          <w:rFonts w:hint="eastAsia"/>
+          <w:lang w:val="en-US" w:eastAsia="zh-CN"/>
+        </w:rPr>
+        <w:br w:type="textWrapping"/>
+      </w:r>
+      <w:r>
+        <w:rPr>
+          <w:rFonts w:hint="eastAsia"/>
+          <w:lang w:val="en-US" w:eastAsia="zh-CN"/>
+        </w:rPr>
+        <w:t>$result = Invoke-RestMethod -Uri "http://localhost:3001/auth/register" `</w:t>
+      </w:r>
+    </w:p>
+    <w:p>
+      <w:pPr>
+        <w:numPr>
+          <w:numId w:val="0"/>
+        </w:numPr>
+        <w:ind w:leftChars="0"/>
+        <w:rPr>
+          <w:rFonts w:hint="eastAsia"/>
+          <w:lang w:val="en-US" w:eastAsia="zh-CN"/>
+        </w:rPr>
+      </w:pPr>
+      <w:r>
+        <w:rPr>
+          <w:rFonts w:hint="eastAsia"/>
+          <w:lang w:val="en-US" w:eastAsia="zh-CN"/>
+        </w:rPr>
+        <w:t xml:space="preserve">  -Method POST `</w:t>
+      </w:r>
+    </w:p>
+    <w:p>
+      <w:pPr>
+        <w:numPr>
+          <w:numId w:val="0"/>
+        </w:numPr>
+        <w:ind w:leftChars="0"/>
+        <w:rPr>
+          <w:rFonts w:hint="eastAsia"/>
+          <w:lang w:val="en-US" w:eastAsia="zh-CN"/>
+        </w:rPr>
+      </w:pPr>
+      <w:r>
+        <w:rPr>
+          <w:rFonts w:hint="eastAsia"/>
+          <w:lang w:val="en-US" w:eastAsia="zh-CN"/>
+        </w:rPr>
+        <w:t xml:space="preserve">  -ContentType "application/json" `</w:t>
+      </w:r>
+    </w:p>
+    <w:p>
+      <w:pPr>
+        <w:numPr>
+          <w:numId w:val="0"/>
+        </w:numPr>
+        <w:ind w:leftChars="0"/>
+        <w:rPr>
+          <w:rFonts w:hint="eastAsia"/>
+          <w:lang w:val="en-US" w:eastAsia="zh-CN"/>
+        </w:rPr>
+      </w:pPr>
+      <w:r>
+        <w:rPr>
+          <w:rFonts w:hint="eastAsia"/>
+          <w:lang w:val="en-US" w:eastAsia="zh-CN"/>
+        </w:rPr>
+        <w:t xml:space="preserve">  -Body '{"email":"test3@test.com","username":"testuser","password":"123456"}'</w:t>
+      </w:r>
+    </w:p>
+    <w:p>
+      <w:pPr>
+        <w:numPr>
+          <w:numId w:val="0"/>
+        </w:numPr>
+        <w:ind w:leftChars="0"/>
+        <w:rPr>
+          <w:rFonts w:hint="eastAsia"/>
+          <w:lang w:val="en-US" w:eastAsia="zh-CN"/>
+        </w:rPr>
+      </w:pPr>
+    </w:p>
+    <w:p>
+      <w:pPr>
+        <w:numPr>
+          <w:numId w:val="0"/>
+        </w:numPr>
+        <w:ind w:leftChars="0"/>
+        <w:rPr>
+          <w:rFonts w:hint="default"/>
+          <w:lang w:val="en-US" w:eastAsia="zh-CN"/>
+        </w:rPr>
+      </w:pPr>
+      <w:r>
+        <w:rPr>
+          <w:rFonts w:hint="eastAsia"/>
+          <w:lang w:val="en-US" w:eastAsia="zh-CN"/>
+        </w:rPr>
+        <w:t>$result.accessToken 就是我们需要的token</w:t>
+      </w:r>
+      <w:bookmarkStart w:id="0" w:name="_GoBack"/>
+      <w:bookmarkEnd w:id="0"/>
+    </w:p>
+    <w:p>
+      <w:pPr>
+        <w:numPr>
+          <w:ilvl w:val="0"/>
+          <w:numId w:val="1"/>
+        </w:numPr>
+        <w:ind w:left="0" w:leftChars="0" w:firstLine="0" w:firstLineChars="0"/>
+        <w:rPr>
+          <w:rFonts w:hint="default"/>
+          <w:lang w:val="en-US" w:eastAsia="zh-CN"/>
+        </w:rPr>
+      </w:pPr>
+      <w:r>
+        <w:rPr>
+          <w:rFonts w:hint="eastAsia"/>
+          <w:lang w:val="en-US" w:eastAsia="zh-CN"/>
+        </w:rPr>
+        <w:t>验证登录已经路由受保护（带token）</w:t>
+      </w:r>
+    </w:p>
+    <w:p>
+      <w:pPr>
+        <w:numPr>
+          <w:numId w:val="0"/>
+        </w:numPr>
+        <w:ind w:leftChars="0"/>
+        <w:rPr>
+          <w:rFonts w:hint="default"/>
+          <w:lang w:val="en-US" w:eastAsia="zh-CN"/>
+        </w:rPr>
+      </w:pPr>
+      <w:r>
+        <w:rPr>
+          <w:rFonts w:hint="default"/>
+          <w:lang w:val="en-US" w:eastAsia="zh-CN"/>
+        </w:rPr>
+        <w:t>$token = "把上面拿到的accessToken粘贴在这里"</w:t>
+      </w:r>
+    </w:p>
+    <w:p>
+      <w:pPr>
+        <w:numPr>
+          <w:numId w:val="0"/>
+        </w:numPr>
+        <w:ind w:leftChars="0"/>
+        <w:rPr>
+          <w:rFonts w:hint="default"/>
+          <w:lang w:val="en-US" w:eastAsia="zh-CN"/>
+        </w:rPr>
+      </w:pPr>
+      <w:r>
+        <w:rPr>
+          <w:rFonts w:hint="default"/>
+          <w:lang w:val="en-US" w:eastAsia="zh-CN"/>
+        </w:rPr>
+        <w:t>Invoke-RestMethod -Uri "http://localhost:3001/protected/profile" `</w:t>
+      </w:r>
+    </w:p>
+    <w:p>
+      <w:pPr>
+        <w:numPr>
+          <w:numId w:val="0"/>
+        </w:numPr>
+        <w:ind w:leftChars="0"/>
+        <w:rPr>
+          <w:rFonts w:hint="default"/>
+          <w:lang w:val="en-US" w:eastAsia="zh-CN"/>
+        </w:rPr>
+      </w:pPr>
+      <w:r>
+        <w:rPr>
+          <w:rFonts w:hint="default"/>
+          <w:lang w:val="en-US" w:eastAsia="zh-CN"/>
+        </w:rPr>
+        <w:t xml:space="preserve">  -Method GET `</w:t>
+      </w:r>
+    </w:p>
+    <w:p>
+      <w:pPr>
+        <w:numPr>
+          <w:numId w:val="0"/>
+        </w:numPr>
+        <w:ind w:leftChars="0"/>
+        <w:rPr>
+          <w:rFonts w:hint="default"/>
+          <w:lang w:val="en-US" w:eastAsia="zh-CN"/>
+        </w:rPr>
+      </w:pPr>
+      <w:r>
+        <w:rPr>
+          <w:rFonts w:hint="default"/>
+          <w:lang w:val="en-US" w:eastAsia="zh-CN"/>
+        </w:rPr>
+        <w:t xml:space="preserve">  -Headers @{ Authorization = "Bearer $token" }</w:t>
+      </w:r>
+    </w:p>
+    <w:p>
+      <w:pPr>
+        <w:numPr>
+          <w:numId w:val="0"/>
+        </w:numPr>
+        <w:ind w:leftChars="0"/>
+        <w:rPr>
+          <w:rFonts w:hint="eastAsia"/>
+          <w:lang w:val="en-US" w:eastAsia="zh-CN"/>
+        </w:rPr>
+      </w:pPr>
+      <w:r>
+        <w:rPr>
+          <w:rFonts w:hint="eastAsia"/>
+          <w:lang w:val="en-US" w:eastAsia="zh-CN"/>
+        </w:rPr>
+        <w:t>期望结果： 返回“已经登录，数据受保护” + 用户信息（without password）</w:t>
+      </w:r>
+    </w:p>
+    <w:p>
+      <w:pPr>
+        <w:numPr>
+          <w:ilvl w:val="0"/>
+          <w:numId w:val="1"/>
+        </w:numPr>
+        <w:ind w:left="0" w:leftChars="0" w:firstLine="0" w:firstLineChars="0"/>
+        <w:rPr>
+          <w:rFonts w:hint="default"/>
+          <w:lang w:val="en-US" w:eastAsia="zh-CN"/>
+        </w:rPr>
+      </w:pPr>
+      <w:r>
+        <w:rPr>
+          <w:rFonts w:hint="eastAsia"/>
+          <w:lang w:val="en-US" w:eastAsia="zh-CN"/>
+        </w:rPr>
+        <w:t>测试不带token访问路由：</w:t>
+      </w:r>
+      <w:r>
+        <w:rPr>
+          <w:rFonts w:hint="eastAsia"/>
+          <w:lang w:val="en-US" w:eastAsia="zh-CN"/>
+        </w:rPr>
+        <w:br w:type="textWrapping"/>
+      </w:r>
+      <w:r>
+        <w:rPr>
+          <w:rFonts w:hint="eastAsia"/>
+          <w:lang w:val="en-US" w:eastAsia="zh-CN"/>
+        </w:rPr>
+        <w:t>Invoke-RestMethod -Uri "http://localhost:3001/protected/profile" -Method GET</w:t>
+      </w:r>
+    </w:p>
+    <w:p>
+      <w:pPr>
+        <w:numPr>
+          <w:numId w:val="0"/>
+        </w:numPr>
+        <w:ind w:leftChars="0"/>
+        <w:rPr>
+          <w:rFonts w:hint="eastAsia"/>
+          <w:lang w:val="en-US" w:eastAsia="zh-CN"/>
+        </w:rPr>
+      </w:pPr>
+      <w:r>
+        <w:rPr>
+          <w:rFonts w:hint="eastAsia"/>
+          <w:lang w:val="en-US" w:eastAsia="zh-CN"/>
+        </w:rPr>
+        <w:t>期望结果： 401 未授权</w:t>
+      </w:r>
+    </w:p>
+    <w:p>
+      <w:pPr>
+        <w:numPr>
+          <w:ilvl w:val="0"/>
+          <w:numId w:val="1"/>
+        </w:numPr>
+        <w:ind w:left="0" w:leftChars="0" w:firstLine="0" w:firstLineChars="0"/>
+        <w:rPr>
+          <w:rFonts w:hint="default"/>
+          <w:lang w:val="en-US" w:eastAsia="zh-CN"/>
+        </w:rPr>
+      </w:pPr>
+      <w:r>
+        <w:rPr>
+          <w:rFonts w:hint="eastAsia"/>
+          <w:lang w:val="en-US" w:eastAsia="zh-CN"/>
+        </w:rPr>
+        <w:t>测试错误密码</w:t>
+      </w:r>
+    </w:p>
+    <w:p>
+      <w:pPr>
+        <w:numPr>
+          <w:numId w:val="0"/>
+        </w:numPr>
+        <w:ind w:leftChars="0"/>
+        <w:rPr>
+          <w:rFonts w:hint="default"/>
+          <w:lang w:val="en-US" w:eastAsia="zh-CN"/>
+        </w:rPr>
+      </w:pPr>
+      <w:r>
+        <w:rPr>
+          <w:rFonts w:hint="default"/>
+          <w:lang w:val="en-US" w:eastAsia="zh-CN"/>
+        </w:rPr>
+        <w:t>Invoke-RestMethod -Uri "http://localhost:3001/auth/login" `</w:t>
+      </w:r>
+    </w:p>
+    <w:p>
+      <w:pPr>
+        <w:numPr>
+          <w:numId w:val="0"/>
+        </w:numPr>
+        <w:ind w:leftChars="0"/>
+        <w:rPr>
+          <w:rFonts w:hint="default"/>
+          <w:lang w:val="en-US" w:eastAsia="zh-CN"/>
+        </w:rPr>
+      </w:pPr>
+      <w:r>
+        <w:rPr>
+          <w:rFonts w:hint="default"/>
+          <w:lang w:val="en-US" w:eastAsia="zh-CN"/>
+        </w:rPr>
+        <w:t xml:space="preserve">  -Method POST `</w:t>
+      </w:r>
+    </w:p>
+    <w:p>
+      <w:pPr>
+        <w:numPr>
+          <w:numId w:val="0"/>
+        </w:numPr>
+        <w:ind w:leftChars="0"/>
+        <w:rPr>
+          <w:rFonts w:hint="default"/>
+          <w:lang w:val="en-US" w:eastAsia="zh-CN"/>
+        </w:rPr>
+      </w:pPr>
+      <w:r>
+        <w:rPr>
+          <w:rFonts w:hint="default"/>
+          <w:lang w:val="en-US" w:eastAsia="zh-CN"/>
+        </w:rPr>
+        <w:t xml:space="preserve">  -ContentType "application/json" `</w:t>
+      </w:r>
+    </w:p>
+    <w:p>
+      <w:pPr>
+        <w:numPr>
+          <w:numId w:val="0"/>
+        </w:numPr>
+        <w:ind w:leftChars="0"/>
+        <w:rPr>
+          <w:rFonts w:hint="default"/>
+          <w:lang w:val="en-US" w:eastAsia="zh-CN"/>
+        </w:rPr>
+      </w:pPr>
+      <w:r>
+        <w:rPr>
+          <w:rFonts w:hint="default"/>
+          <w:lang w:val="en-US" w:eastAsia="zh-CN"/>
+        </w:rPr>
+        <w:t xml:space="preserve">  -Body '{"email":"你的邮箱@test.com","password":"wrongpassword"}'</w:t>
+      </w:r>
+    </w:p>
+    <w:p>
+      <w:pPr>
+        <w:numPr>
+          <w:numId w:val="0"/>
+        </w:numPr>
+        <w:ind w:leftChars="0"/>
+        <w:rPr>
+          <w:rFonts w:hint="default"/>
+          <w:lang w:val="en-US" w:eastAsia="zh-CN"/>
+        </w:rPr>
+      </w:pPr>
+    </w:p>
     <w:sectPr>
       <w:pgSz w:w="11906" w:h="16838"/>
       <w:pgMar w:top="1440" w:right="1800" w:bottom="1440" w:left="1800" w:header="851" w:footer="992" w:gutter="0"/>
@@ -658,12 +1440,32 @@
 </w:document>
 </file>
 
+<file path=word/numbering.xml><?xml version="1.0" encoding="utf-8"?>
+<w:numbering xmlns:wpc="http://schemas.microsoft.com/office/word/2010/wordprocessingCanvas" xmlns:mc="http://schemas.openxmlformats.org/markup-compatibility/2006" xmlns:o="urn:schemas-microsoft-com:office:office" xmlns:r="http://schemas.openxmlformats.org/officeDocument/2006/relationships" xmlns:m="http://schemas.openxmlformats.org/officeDocument/2006/math" xmlns:v="urn:schemas-microsoft-com:vml" xmlns:wp14="http://schemas.microsoft.com/office/word/2010/wordprocessingDrawing" xmlns:wp="http://schemas.openxmlformats.org/drawingml/2006/wordprocessingDrawing" xmlns:w10="urn:schemas-microsoft-com:office:word" xmlns:w="http://schemas.openxmlformats.org/wordprocessingml/2006/main" xmlns:w14="http://schemas.microsoft.com/office/word/2010/wordml" xmlns:wpg="http://schemas.microsoft.com/office/word/2010/wordprocessingGroup" xmlns:wpi="http://schemas.microsoft.com/office/word/2010/wordprocessingInk" xmlns:wne="http://schemas.microsoft.com/office/word/2006/wordml" xmlns:wps="http://schemas.microsoft.com/office/word/2010/wordprocessingShape" xmlns:wpsCustomData="http://www.wps.cn/officeDocument/2013/wpsCustomData" mc:Ignorable="w14 wp14">
+  <w:abstractNum w:abstractNumId="0">
+    <w:nsid w:val="52F4A286"/>
+    <w:multiLevelType w:val="singleLevel"/>
+    <w:tmpl w:val="52F4A286"/>
+    <w:lvl w:ilvl="0" w:tentative="0">
+      <w:start w:val="2"/>
+      <w:numFmt w:val="decimal"/>
+      <w:suff w:val="space"/>
+      <w:lvlText w:val="%1."/>
+      <w:lvlJc w:val="left"/>
+    </w:lvl>
+  </w:abstractNum>
+  <w:num w:numId="1">
+    <w:abstractNumId w:val="0"/>
+  </w:num>
+</w:numbering>
+</file>
+
 <file path=word/styles.xml><?xml version="1.0" encoding="utf-8"?>
 <w:styles xmlns:mc="http://schemas.openxmlformats.org/markup-compatibility/2006" xmlns:o="urn:schemas-microsoft-com:office:office" xmlns:r="http://schemas.openxmlformats.org/officeDocument/2006/relationships" xmlns:m="http://schemas.openxmlformats.org/officeDocument/2006/math" xmlns:v="urn:schemas-microsoft-com:vml" xmlns:w="http://schemas.openxmlformats.org/wordprocessingml/2006/main" xmlns:w14="http://schemas.microsoft.com/office/word/2010/wordml" xmlns:w10="urn:schemas-microsoft-com:office:word" xmlns:sl="http://schemas.openxmlformats.org/schemaLibrary/2006/main" xmlns:wpsCustomData="http://www.wps.cn/officeDocument/2013/wpsCustomData" mc:Ignorable="w14">
   <w:docDefaults>
     <w:rPrDefault>
       <w:rPr>
-        <w:rFonts w:asciiTheme="minorHAnsi" w:hAnsiTheme="minorHAnsi" w:eastAsiaTheme="minorEastAsia" w:cstheme="minorBidi"/>
+        <w:rFonts w:ascii="Times New Roman" w:hAnsi="Times New Roman" w:eastAsia="宋体" w:cs="Times New Roman"/>
       </w:rPr>
     </w:rPrDefault>
     <w:pPrDefault/>
@@ -935,6 +1737,24 @@
     </w:rPr>
   </w:style>
   <w:style w:type="paragraph" w:styleId="2">
+    <w:name w:val="heading 1"/>
+    <w:basedOn w:val="1"/>
+    <w:next w:val="1"/>
+    <w:qFormat/>
+    <w:uiPriority w:val="0"/>
+    <w:pPr>
+      <w:keepNext/>
+      <w:keepLines/>
+      <w:spacing w:before="340" w:beforeLines="0" w:beforeAutospacing="0" w:after="330" w:afterLines="0" w:afterAutospacing="0" w:line="576" w:lineRule="auto"/>
+      <w:outlineLvl w:val="0"/>
+    </w:pPr>
+    <w:rPr>
+      <w:b/>
+      <w:kern w:val="44"/>
+      <w:sz w:val="44"/>
+    </w:rPr>
+  </w:style>
+  <w:style w:type="paragraph" w:styleId="3">
     <w:name w:val="heading 2"/>
     <w:basedOn w:val="1"/>
     <w:next w:val="1"/>
@@ -953,12 +1773,12 @@
       <w:sz w:val="32"/>
     </w:rPr>
   </w:style>
-  <w:style w:type="character" w:default="1" w:styleId="4">
+  <w:style w:type="character" w:default="1" w:styleId="5">
     <w:name w:val="Default Paragraph Font"/>
     <w:semiHidden/>
     <w:uiPriority w:val="0"/>
   </w:style>
-  <w:style w:type="table" w:default="1" w:styleId="3">
+  <w:style w:type="table" w:default="1" w:styleId="4">
     <w:name w:val="Normal Table"/>
     <w:semiHidden/>
     <w:qFormat/>

</xml_diff>

<commit_message>
stage 1, 2, 3 COMPLETED
</commit_message>
<xml_diff>
--- a/项目实时进展与log.docx
+++ b/项目实时进展与log.docx
@@ -443,31 +443,44 @@
         <w:rPr>
           <w:rFonts w:hint="eastAsia"/>
         </w:rPr>
-        <w:t>阶段三：联调</w:t>
-      </w:r>
-    </w:p>
-    <w:p>
-      <w:pPr>
-        <w:rPr>
-          <w:rFonts w:hint="eastAsia"/>
-        </w:rPr>
-      </w:pPr>
-      <w:r>
-        <w:rPr>
-          <w:rFonts w:hint="eastAsia"/>
-        </w:rPr>
-        <w:t xml:space="preserve">  Step 13 → 配置后端 CORS，前端 API 地址</w:t>
-      </w:r>
-    </w:p>
-    <w:p>
-      <w:r>
-        <w:rPr>
-          <w:rFonts w:hint="eastAsia"/>
-        </w:rPr>
-        <w:t xml:space="preserve">  Step 14 → 端到端测试完整流程</w:t>
+        <w:t>阶段三：</w:t>
+      </w:r>
+      <w:r>
+        <w:rPr>
+          <w:rFonts w:hint="eastAsia"/>
+          <w:lang w:val="en-US" w:eastAsia="zh-CN"/>
+        </w:rPr>
+        <w:t xml:space="preserve"> </w:t>
       </w:r>
       <w:bookmarkStart w:id="0" w:name="_GoBack"/>
       <w:bookmarkEnd w:id="0"/>
+      <w:r>
+        <w:rPr>
+          <w:rFonts w:hint="eastAsia"/>
+        </w:rPr>
+        <w:t>联调</w:t>
+      </w:r>
+    </w:p>
+    <w:p>
+      <w:pPr>
+        <w:rPr>
+          <w:rFonts w:hint="eastAsia"/>
+        </w:rPr>
+      </w:pPr>
+      <w:r>
+        <w:rPr>
+          <w:rFonts w:hint="eastAsia"/>
+        </w:rPr>
+        <w:t xml:space="preserve">  Step 13 → 配置后端 CORS，前端 API 地址</w:t>
+      </w:r>
+    </w:p>
+    <w:p>
+      <w:r>
+        <w:rPr>
+          <w:rFonts w:hint="eastAsia"/>
+        </w:rPr>
+        <w:t xml:space="preserve">  Step 14 → 端到端测试完整流程</w:t>
+      </w:r>
     </w:p>
     <w:p>
       <w:pPr>

</xml_diff>

<commit_message>
finish phase2 with success test of listing products
</commit_message>
<xml_diff>
--- a/项目实时进展与log.docx
+++ b/项目实时进展与log.docx
@@ -452,8 +452,6 @@
         </w:rPr>
         <w:t xml:space="preserve"> </w:t>
       </w:r>
-      <w:bookmarkStart w:id="0" w:name="_GoBack"/>
-      <w:bookmarkEnd w:id="0"/>
       <w:r>
         <w:rPr>
           <w:rFonts w:hint="eastAsia"/>
@@ -2151,7 +2149,7 @@
     <w:p>
       <w:pPr>
         <w:rPr>
-          <w:rFonts w:hint="default"/>
+          <w:rFonts w:hint="eastAsia"/>
           <w:lang w:val="en-US" w:eastAsia="zh-CN"/>
         </w:rPr>
       </w:pPr>
@@ -2162,6 +2160,683 @@
         </w:rPr>
         <w:t>应该还在 Dashboard，不会被踢回登录页（token 存在 localStorage）</w:t>
       </w:r>
+      <w:r>
+        <w:rPr>
+          <w:rFonts w:hint="eastAsia"/>
+          <w:lang w:val="en-US" w:eastAsia="zh-CN"/>
+        </w:rPr>
+        <w:t xml:space="preserve"> </w:t>
+      </w:r>
+    </w:p>
+    <w:p>
+      <w:pPr>
+        <w:rPr>
+          <w:rFonts w:hint="eastAsia"/>
+          <w:lang w:val="en-US" w:eastAsia="zh-CN"/>
+        </w:rPr>
+      </w:pPr>
+    </w:p>
+    <w:p>
+      <w:pPr>
+        <w:rPr>
+          <w:rFonts w:hint="eastAsia"/>
+          <w:lang w:val="en-US" w:eastAsia="zh-CN"/>
+        </w:rPr>
+      </w:pPr>
+    </w:p>
+    <w:p>
+      <w:pPr>
+        <w:pStyle w:val="2"/>
+        <w:bidi w:val="0"/>
+        <w:rPr>
+          <w:rFonts w:hint="eastAsia"/>
+          <w:lang w:val="en-US" w:eastAsia="zh-CN"/>
+        </w:rPr>
+      </w:pPr>
+      <w:r>
+        <w:rPr>
+          <w:rFonts w:hint="eastAsia"/>
+          <w:lang w:val="en-US" w:eastAsia="zh-CN"/>
+        </w:rPr>
+        <w:t>增加用户 List功能</w:t>
+      </w:r>
+    </w:p>
+    <w:p>
+      <w:pPr>
+        <w:rPr>
+          <w:rFonts w:hint="default"/>
+          <w:lang w:val="en-US" w:eastAsia="zh-CN"/>
+        </w:rPr>
+      </w:pPr>
+      <w:r>
+        <w:rPr>
+          <w:rFonts w:hint="default"/>
+          <w:lang w:val="en-US" w:eastAsia="zh-CN"/>
+        </w:rPr>
+        <w:t>Phase 2 — 后端</w:t>
+      </w:r>
+    </w:p>
+    <w:p>
+      <w:pPr>
+        <w:rPr>
+          <w:rFonts w:hint="default"/>
+          <w:lang w:val="en-US" w:eastAsia="zh-CN"/>
+        </w:rPr>
+      </w:pPr>
+    </w:p>
+    <w:p>
+      <w:pPr>
+        <w:rPr>
+          <w:rFonts w:hint="default"/>
+          <w:lang w:val="en-US" w:eastAsia="zh-CN"/>
+        </w:rPr>
+      </w:pPr>
+      <w:r>
+        <w:rPr>
+          <w:rFonts w:hint="default"/>
+          <w:lang w:val="en-US" w:eastAsia="zh-CN"/>
+        </w:rPr>
+        <w:t>Step 1：创建 dto/create-listing.dto.ts + dto/update-listing.dto.ts</w:t>
+      </w:r>
+    </w:p>
+    <w:p>
+      <w:pPr>
+        <w:rPr>
+          <w:rFonts w:hint="default"/>
+          <w:lang w:val="en-US" w:eastAsia="zh-CN"/>
+        </w:rPr>
+      </w:pPr>
+      <w:r>
+        <w:rPr>
+          <w:rFonts w:hint="eastAsia"/>
+          <w:lang w:val="en-US" w:eastAsia="zh-CN"/>
+        </w:rPr>
+        <w:t xml:space="preserve">Dto： </w:t>
+      </w:r>
+      <w:r>
+        <w:rPr>
+          <w:rFonts w:ascii="宋体" w:hAnsi="宋体" w:eastAsia="宋体" w:cs="宋体"/>
+          <w:sz w:val="24"/>
+          <w:szCs w:val="24"/>
+        </w:rPr>
+        <w:t>告诉 NestJS：这个接口应该接收什么样的数据。</w:t>
+      </w:r>
+    </w:p>
+    <w:p>
+      <w:pPr>
+        <w:rPr>
+          <w:rFonts w:hint="default"/>
+          <w:lang w:val="en-US" w:eastAsia="zh-CN"/>
+        </w:rPr>
+      </w:pPr>
+      <w:r>
+        <w:rPr>
+          <w:rFonts w:hint="default"/>
+          <w:lang w:val="en-US" w:eastAsia="zh-CN"/>
+        </w:rPr>
+        <w:t>Step 2：创建 listings.service.ts</w:t>
+      </w:r>
+    </w:p>
+    <w:p>
+      <w:pPr>
+        <w:rPr>
+          <w:rFonts w:hint="default"/>
+          <w:lang w:val="en-US" w:eastAsia="zh-CN"/>
+        </w:rPr>
+      </w:pPr>
+      <w:r>
+        <w:rPr>
+          <w:rFonts w:hint="default"/>
+          <w:lang w:val="en-US" w:eastAsia="zh-CN"/>
+        </w:rPr>
+        <w:t>Step 3：创建 listings.controller.ts</w:t>
+      </w:r>
+    </w:p>
+    <w:p>
+      <w:pPr>
+        <w:rPr>
+          <w:rFonts w:hint="default"/>
+          <w:lang w:val="en-US" w:eastAsia="zh-CN"/>
+        </w:rPr>
+      </w:pPr>
+      <w:r>
+        <w:rPr>
+          <w:rFonts w:hint="default"/>
+          <w:lang w:val="en-US" w:eastAsia="zh-CN"/>
+        </w:rPr>
+        <w:t>Step 4：创建 listings.module.ts</w:t>
+      </w:r>
+    </w:p>
+    <w:p>
+      <w:pPr>
+        <w:rPr>
+          <w:rFonts w:hint="default"/>
+          <w:lang w:val="en-US" w:eastAsia="zh-CN"/>
+        </w:rPr>
+      </w:pPr>
+      <w:r>
+        <w:rPr>
+          <w:rFonts w:hint="default"/>
+          <w:lang w:val="en-US" w:eastAsia="zh-CN"/>
+        </w:rPr>
+        <w:t>Step 5：在 app.module.ts 注册 ListingsModule</w:t>
+      </w:r>
+    </w:p>
+    <w:p>
+      <w:pPr>
+        <w:rPr>
+          <w:rFonts w:hint="default"/>
+          <w:lang w:val="en-US" w:eastAsia="zh-CN"/>
+        </w:rPr>
+      </w:pPr>
+      <w:r>
+        <w:rPr>
+          <w:rFonts w:hint="default"/>
+          <w:lang w:val="en-US" w:eastAsia="zh-CN"/>
+        </w:rPr>
+        <w:t>Phase 3 — 前端</w:t>
+      </w:r>
+    </w:p>
+    <w:p>
+      <w:pPr>
+        <w:rPr>
+          <w:rFonts w:hint="default"/>
+          <w:lang w:val="en-US" w:eastAsia="zh-CN"/>
+        </w:rPr>
+      </w:pPr>
+    </w:p>
+    <w:p>
+      <w:pPr>
+        <w:rPr>
+          <w:rFonts w:hint="default"/>
+          <w:lang w:val="en-US" w:eastAsia="zh-CN"/>
+        </w:rPr>
+      </w:pPr>
+      <w:r>
+        <w:rPr>
+          <w:rFonts w:hint="default"/>
+          <w:lang w:val="en-US" w:eastAsia="zh-CN"/>
+        </w:rPr>
+        <w:t>Step 6：创建 api/listings.ts</w:t>
+      </w:r>
+    </w:p>
+    <w:p>
+      <w:pPr>
+        <w:rPr>
+          <w:rFonts w:hint="default"/>
+          <w:lang w:val="en-US" w:eastAsia="zh-CN"/>
+        </w:rPr>
+      </w:pPr>
+      <w:r>
+        <w:rPr>
+          <w:rFonts w:hint="default"/>
+          <w:lang w:val="en-US" w:eastAsia="zh-CN"/>
+        </w:rPr>
+        <w:t>Step 7：创建 ListingsPage.tsx（浏览全部）</w:t>
+      </w:r>
+    </w:p>
+    <w:p>
+      <w:pPr>
+        <w:rPr>
+          <w:rFonts w:hint="default"/>
+          <w:lang w:val="en-US" w:eastAsia="zh-CN"/>
+        </w:rPr>
+      </w:pPr>
+      <w:r>
+        <w:rPr>
+          <w:rFonts w:hint="default"/>
+          <w:lang w:val="en-US" w:eastAsia="zh-CN"/>
+        </w:rPr>
+        <w:t>Step 8：创建 ListingDetailPage.tsx（详情 + 本人才显示编辑/删除）</w:t>
+      </w:r>
+    </w:p>
+    <w:p>
+      <w:pPr>
+        <w:rPr>
+          <w:rFonts w:hint="default"/>
+          <w:lang w:val="en-US" w:eastAsia="zh-CN"/>
+        </w:rPr>
+      </w:pPr>
+      <w:r>
+        <w:rPr>
+          <w:rFonts w:hint="default"/>
+          <w:lang w:val="en-US" w:eastAsia="zh-CN"/>
+        </w:rPr>
+        <w:t>Step 9：创建 CreateListingPage.tsx</w:t>
+      </w:r>
+    </w:p>
+    <w:p>
+      <w:pPr>
+        <w:rPr>
+          <w:rFonts w:hint="default"/>
+          <w:lang w:val="en-US" w:eastAsia="zh-CN"/>
+        </w:rPr>
+      </w:pPr>
+      <w:r>
+        <w:rPr>
+          <w:rFonts w:hint="default"/>
+          <w:lang w:val="en-US" w:eastAsia="zh-CN"/>
+        </w:rPr>
+        <w:t>Step 10：创建 MyListingsPage.tsx</w:t>
+      </w:r>
+    </w:p>
+    <w:p>
+      <w:pPr>
+        <w:rPr>
+          <w:rFonts w:hint="default"/>
+          <w:lang w:val="en-US" w:eastAsia="zh-CN"/>
+        </w:rPr>
+      </w:pPr>
+      <w:r>
+        <w:rPr>
+          <w:rFonts w:hint="default"/>
+          <w:lang w:val="en-US" w:eastAsia="zh-CN"/>
+        </w:rPr>
+        <w:t>Step 11：创建 EditListingPage.tsx</w:t>
+      </w:r>
+    </w:p>
+    <w:p>
+      <w:pPr>
+        <w:rPr>
+          <w:rFonts w:hint="default"/>
+          <w:lang w:val="en-US" w:eastAsia="zh-CN"/>
+        </w:rPr>
+      </w:pPr>
+      <w:r>
+        <w:rPr>
+          <w:rFonts w:hint="default"/>
+          <w:lang w:val="en-US" w:eastAsia="zh-CN"/>
+        </w:rPr>
+        <w:t>Step 12：修改 App.tsx 注册路由</w:t>
+      </w:r>
+    </w:p>
+    <w:p>
+      <w:pPr>
+        <w:rPr>
+          <w:rFonts w:hint="default"/>
+          <w:lang w:val="en-US" w:eastAsia="zh-CN"/>
+        </w:rPr>
+      </w:pPr>
+    </w:p>
+    <w:p>
+      <w:pPr>
+        <w:ind w:left="210" w:hanging="210" w:hangingChars="100"/>
+        <w:rPr>
+          <w:rFonts w:hint="eastAsia"/>
+          <w:lang w:val="en-US" w:eastAsia="zh-CN"/>
+        </w:rPr>
+      </w:pPr>
+      <w:r>
+        <w:rPr>
+          <w:rFonts w:hint="eastAsia"/>
+          <w:lang w:val="en-US" w:eastAsia="zh-CN"/>
+        </w:rPr>
+        <w:t>List module 更新后测试</w:t>
+      </w:r>
+    </w:p>
+    <w:p>
+      <w:pPr>
+        <w:ind w:left="210" w:hanging="210" w:hangingChars="100"/>
+        <w:rPr>
+          <w:rFonts w:hint="eastAsia"/>
+          <w:lang w:val="en-US" w:eastAsia="zh-CN"/>
+        </w:rPr>
+      </w:pPr>
+      <w:r>
+        <w:rPr>
+          <w:rFonts w:hint="eastAsia"/>
+          <w:lang w:val="en-US" w:eastAsia="zh-CN"/>
+        </w:rPr>
+        <w:t>Postman:</w:t>
+      </w:r>
+      <w:r>
+        <w:rPr>
+          <w:rFonts w:hint="eastAsia"/>
+          <w:lang w:val="en-US" w:eastAsia="zh-CN"/>
+        </w:rPr>
+        <w:br w:type="textWrapping"/>
+      </w:r>
+      <w:r>
+        <w:rPr>
+          <w:rFonts w:hint="eastAsia"/>
+          <w:lang w:val="en-US" w:eastAsia="zh-CN"/>
+        </w:rPr>
+        <w:t>GET  http://localhost:3001/listings         → [] (空数组)</w:t>
+      </w:r>
+    </w:p>
+    <w:p>
+      <w:pPr>
+        <w:ind w:left="210" w:hanging="210" w:hangingChars="100"/>
+        <w:rPr>
+          <w:rFonts w:hint="eastAsia"/>
+          <w:lang w:val="en-US" w:eastAsia="zh-CN"/>
+        </w:rPr>
+      </w:pPr>
+      <w:r>
+        <w:rPr>
+          <w:rFonts w:hint="eastAsia"/>
+          <w:lang w:val="en-US" w:eastAsia="zh-CN"/>
+        </w:rPr>
+        <w:t>POST http://localhost:3001/listings         → 401 (无 token)</w:t>
+      </w:r>
+    </w:p>
+    <w:p>
+      <w:pPr>
+        <w:ind w:left="210" w:hanging="210" w:hangingChars="100"/>
+        <w:rPr>
+          <w:rFonts w:hint="eastAsia"/>
+          <w:lang w:val="en-US" w:eastAsia="zh-CN"/>
+        </w:rPr>
+      </w:pPr>
+      <w:r>
+        <w:rPr>
+          <w:rFonts w:hint="eastAsia"/>
+          <w:lang w:val="en-US" w:eastAsia="zh-CN"/>
+        </w:rPr>
+        <w:t>POST http://localhost:3001/auth/login       → 拿到 token</w:t>
+      </w:r>
+    </w:p>
+    <w:p>
+      <w:pPr>
+        <w:ind w:left="210" w:hanging="210" w:hangingChars="100"/>
+        <w:rPr>
+          <w:rFonts w:hint="eastAsia"/>
+          <w:lang w:val="en-US" w:eastAsia="zh-CN"/>
+        </w:rPr>
+      </w:pPr>
+      <w:r>
+        <w:rPr>
+          <w:rFonts w:hint="eastAsia"/>
+          <w:lang w:val="en-US" w:eastAsia="zh-CN"/>
+        </w:rPr>
+        <w:t>格式是raw， Json</w:t>
+      </w:r>
+    </w:p>
+    <w:p>
+      <w:pPr>
+        <w:ind w:left="210" w:hanging="210" w:hangingChars="100"/>
+        <w:rPr>
+          <w:rFonts w:hint="eastAsia"/>
+          <w:lang w:val="en-US" w:eastAsia="zh-CN"/>
+        </w:rPr>
+      </w:pPr>
+      <w:r>
+        <w:rPr>
+          <w:rFonts w:hint="eastAsia"/>
+          <w:lang w:val="en-US" w:eastAsia="zh-CN"/>
+        </w:rPr>
+        <w:t>{"email":"你的邮箱@test.com","username":"你的名字","password":"123456"}</w:t>
+      </w:r>
+    </w:p>
+    <w:p>
+      <w:pPr>
+        <w:ind w:left="210" w:hanging="210" w:hangingChars="100"/>
+        <w:rPr>
+          <w:rFonts w:hint="eastAsia"/>
+          <w:lang w:val="en-US" w:eastAsia="zh-CN"/>
+        </w:rPr>
+      </w:pPr>
+    </w:p>
+    <w:p>
+      <w:pPr>
+        <w:ind w:left="210" w:hanging="210" w:hangingChars="100"/>
+        <w:rPr>
+          <w:rFonts w:hint="default"/>
+          <w:lang w:val="en-US" w:eastAsia="zh-CN"/>
+        </w:rPr>
+      </w:pPr>
+      <w:r>
+        <w:rPr>
+          <w:rFonts w:hint="eastAsia"/>
+          <w:lang w:val="en-US" w:eastAsia="zh-CN"/>
+        </w:rPr>
+        <w:t>期望返回值：token</w:t>
+      </w:r>
+    </w:p>
+    <w:p>
+      <w:pPr>
+        <w:ind w:left="210" w:hanging="210" w:hangingChars="100"/>
+        <w:rPr>
+          <w:rFonts w:hint="default"/>
+          <w:lang w:val="en-US" w:eastAsia="zh-CN"/>
+        </w:rPr>
+      </w:pPr>
+    </w:p>
+    <w:p>
+      <w:pPr>
+        <w:ind w:left="210" w:hanging="210" w:hangingChars="100"/>
+        <w:rPr>
+          <w:rFonts w:hint="eastAsia"/>
+          <w:lang w:val="en-US" w:eastAsia="zh-CN"/>
+        </w:rPr>
+      </w:pPr>
+      <w:r>
+        <w:rPr>
+          <w:rFonts w:hint="eastAsia"/>
+          <w:lang w:val="en-US" w:eastAsia="zh-CN"/>
+        </w:rPr>
+        <w:t>POST http://localhost:3001/listings (带token) → 201 新 listing</w:t>
+      </w:r>
+    </w:p>
+    <w:p>
+      <w:pPr>
+        <w:ind w:left="210" w:hanging="210" w:hangingChars="100"/>
+        <w:rPr>
+          <w:rFonts w:hint="default"/>
+          <w:lang w:val="en-US" w:eastAsia="zh-CN"/>
+        </w:rPr>
+      </w:pPr>
+      <w:r>
+        <w:rPr>
+          <w:rFonts w:hint="eastAsia"/>
+          <w:lang w:val="en-US" w:eastAsia="zh-CN"/>
+        </w:rPr>
+        <w:t>Token里填token就行</w:t>
+      </w:r>
+    </w:p>
+    <w:p>
+      <w:pPr>
+        <w:rPr>
+          <w:rFonts w:hint="eastAsia"/>
+          <w:lang w:val="en-US" w:eastAsia="zh-CN"/>
+        </w:rPr>
+      </w:pPr>
+    </w:p>
+    <w:p>
+      <w:pPr>
+        <w:ind w:left="210" w:hanging="210" w:hangingChars="100"/>
+        <w:rPr>
+          <w:rFonts w:hint="eastAsia"/>
+          <w:lang w:val="en-US" w:eastAsia="zh-CN"/>
+        </w:rPr>
+      </w:pPr>
+      <w:r>
+        <w:drawing>
+          <wp:inline distT="0" distB="0" distL="114300" distR="114300">
+            <wp:extent cx="3322955" cy="1209040"/>
+            <wp:effectExtent l="0" t="0" r="14605" b="10160"/>
+            <wp:docPr id="14" name="图片 2"/>
+            <wp:cNvGraphicFramePr>
+              <a:graphicFrameLocks xmlns:a="http://schemas.openxmlformats.org/drawingml/2006/main" noChangeAspect="1"/>
+            </wp:cNvGraphicFramePr>
+            <a:graphic xmlns:a="http://schemas.openxmlformats.org/drawingml/2006/main">
+              <a:graphicData uri="http://schemas.openxmlformats.org/drawingml/2006/picture">
+                <pic:pic xmlns:pic="http://schemas.openxmlformats.org/drawingml/2006/picture">
+                  <pic:nvPicPr>
+                    <pic:cNvPr id="14" name="图片 2"/>
+                    <pic:cNvPicPr>
+                      <a:picLocks noChangeAspect="1"/>
+                    </pic:cNvPicPr>
+                  </pic:nvPicPr>
+                  <pic:blipFill>
+                    <a:blip r:embed="rId17"/>
+                    <a:stretch>
+                      <a:fillRect/>
+                    </a:stretch>
+                  </pic:blipFill>
+                  <pic:spPr>
+                    <a:xfrm>
+                      <a:off x="0" y="0"/>
+                      <a:ext cx="3322955" cy="1209040"/>
+                    </a:xfrm>
+                    <a:prstGeom prst="rect">
+                      <a:avLst/>
+                    </a:prstGeom>
+                    <a:noFill/>
+                    <a:ln>
+                      <a:noFill/>
+                    </a:ln>
+                  </pic:spPr>
+                </pic:pic>
+              </a:graphicData>
+            </a:graphic>
+          </wp:inline>
+        </w:drawing>
+      </w:r>
+    </w:p>
+    <w:p>
+      <w:pPr>
+        <w:ind w:left="210" w:hanging="210" w:hangingChars="100"/>
+        <w:rPr>
+          <w:rFonts w:hint="eastAsia"/>
+          <w:lang w:val="en-US" w:eastAsia="zh-CN"/>
+        </w:rPr>
+      </w:pPr>
+      <w:r>
+        <w:rPr>
+          <w:rFonts w:hint="eastAsia"/>
+          <w:lang w:val="en-US" w:eastAsia="zh-CN"/>
+        </w:rPr>
+        <w:t>Body 填list的信息，例如：</w:t>
+      </w:r>
+      <w:r>
+        <w:rPr>
+          <w:rFonts w:hint="eastAsia"/>
+          <w:lang w:val="en-US" w:eastAsia="zh-CN"/>
+        </w:rPr>
+        <w:br w:type="textWrapping"/>
+      </w:r>
+      <w:r>
+        <w:rPr>
+          <w:rFonts w:hint="eastAsia"/>
+          <w:lang w:val="en-US" w:eastAsia="zh-CN"/>
+        </w:rPr>
+        <w:t>{</w:t>
+      </w:r>
+    </w:p>
+    <w:p>
+      <w:pPr>
+        <w:ind w:left="210" w:hanging="210" w:hangingChars="100"/>
+        <w:rPr>
+          <w:rFonts w:hint="eastAsia"/>
+          <w:lang w:val="en-US" w:eastAsia="zh-CN"/>
+        </w:rPr>
+      </w:pPr>
+      <w:r>
+        <w:rPr>
+          <w:rFonts w:hint="eastAsia"/>
+          <w:lang w:val="en-US" w:eastAsia="zh-CN"/>
+        </w:rPr>
+        <w:t xml:space="preserve">  "title": "Yamaha U1",</w:t>
+      </w:r>
+    </w:p>
+    <w:p>
+      <w:pPr>
+        <w:ind w:left="210" w:hanging="210" w:hangingChars="100"/>
+        <w:rPr>
+          <w:rFonts w:hint="eastAsia"/>
+          <w:lang w:val="en-US" w:eastAsia="zh-CN"/>
+        </w:rPr>
+      </w:pPr>
+      <w:r>
+        <w:rPr>
+          <w:rFonts w:hint="eastAsia"/>
+          <w:lang w:val="en-US" w:eastAsia="zh-CN"/>
+        </w:rPr>
+        <w:t xml:space="preserve">  "description": "A well maintained upright piano in good condition.",</w:t>
+      </w:r>
+    </w:p>
+    <w:p>
+      <w:pPr>
+        <w:ind w:left="210" w:hanging="210" w:hangingChars="100"/>
+        <w:rPr>
+          <w:rFonts w:hint="eastAsia"/>
+          <w:lang w:val="en-US" w:eastAsia="zh-CN"/>
+        </w:rPr>
+      </w:pPr>
+      <w:r>
+        <w:rPr>
+          <w:rFonts w:hint="eastAsia"/>
+          <w:lang w:val="en-US" w:eastAsia="zh-CN"/>
+        </w:rPr>
+        <w:t xml:space="preserve">  "price": 5000,</w:t>
+      </w:r>
+    </w:p>
+    <w:p>
+      <w:pPr>
+        <w:ind w:left="210" w:hanging="210" w:hangingChars="100"/>
+        <w:rPr>
+          <w:rFonts w:hint="eastAsia"/>
+          <w:lang w:val="en-US" w:eastAsia="zh-CN"/>
+        </w:rPr>
+      </w:pPr>
+      <w:r>
+        <w:rPr>
+          <w:rFonts w:hint="eastAsia"/>
+          <w:lang w:val="en-US" w:eastAsia="zh-CN"/>
+        </w:rPr>
+        <w:t xml:space="preserve">  "brand": "Yamaha",</w:t>
+      </w:r>
+    </w:p>
+    <w:p>
+      <w:pPr>
+        <w:ind w:left="210" w:hanging="210" w:hangingChars="100"/>
+        <w:rPr>
+          <w:rFonts w:hint="eastAsia"/>
+          <w:lang w:val="en-US" w:eastAsia="zh-CN"/>
+        </w:rPr>
+      </w:pPr>
+      <w:r>
+        <w:rPr>
+          <w:rFonts w:hint="eastAsia"/>
+          <w:lang w:val="en-US" w:eastAsia="zh-CN"/>
+        </w:rPr>
+        <w:t xml:space="preserve">  "condition": "good",</w:t>
+      </w:r>
+    </w:p>
+    <w:p>
+      <w:pPr>
+        <w:ind w:left="210" w:hanging="210" w:hangingChars="100"/>
+        <w:rPr>
+          <w:rFonts w:hint="eastAsia"/>
+          <w:lang w:val="en-US" w:eastAsia="zh-CN"/>
+        </w:rPr>
+      </w:pPr>
+      <w:r>
+        <w:rPr>
+          <w:rFonts w:hint="eastAsia"/>
+          <w:lang w:val="en-US" w:eastAsia="zh-CN"/>
+        </w:rPr>
+        <w:t xml:space="preserve">  "location": "Melbourne"</w:t>
+      </w:r>
+    </w:p>
+    <w:p>
+      <w:pPr>
+        <w:ind w:left="210" w:hanging="210" w:hangingChars="100"/>
+        <w:rPr>
+          <w:rFonts w:hint="eastAsia"/>
+          <w:lang w:val="en-US" w:eastAsia="zh-CN"/>
+        </w:rPr>
+      </w:pPr>
+      <w:r>
+        <w:rPr>
+          <w:rFonts w:hint="eastAsia"/>
+          <w:lang w:val="en-US" w:eastAsia="zh-CN"/>
+        </w:rPr>
+        <w:t>}</w:t>
+      </w:r>
+      <w:bookmarkStart w:id="0" w:name="_GoBack"/>
+      <w:bookmarkEnd w:id="0"/>
     </w:p>
     <w:sectPr>
       <w:pgSz w:w="11906" w:h="16838"/>

</xml_diff>